<commit_message>
Testing, refactor, and release preparation + New feature added
- Add xlsx to csv feature
- Run all tests and add missing edge cases.
- Refactor Streamlit pages so they only call services.
- Add database/storage integration tests.
- Confirm raw SQL examples and SQLAlchemy equivalents are documented.
- Review logging and error messages.
- Freeze dependencies from the working environment.
- Complete README local setup and usage instructions.
</commit_message>
<xml_diff>
--- a/docs/Smart_Workspace_Manager_Folder_Structure_Documentation.docx
+++ b/docs/Smart_Workspace_Manager_Folder_Structure_Documentation.docx
@@ -524,11 +524,9 @@
                 <w:b/>
                 <w:color w:val="17365D"/>
               </w:rPr>
-              <w:t xml:space="preserve">Most important rule: </w:t>
+              <w:t>Most important rule: The user interface calls backend services. It must never contain the main file-management, analysis, report generation, or database logic. This is what allows Streamlit to be replaced by React without rewriting the system.</w:t>
             </w:r>
-            <w:r>
-              <w:t>The user interface calls backend services. It must never contain the main file-management, analysis, report, ML, or database logic. This is what allows Streamlit to be replaced by React without rewriting the system.</w:t>
-            </w:r>
+            <w:r/>
           </w:p>
         </w:tc>
       </w:tr>
@@ -976,8 +974,6 @@
               <w:br/>
               <w:t>|   |-- reports/</w:t>
               <w:br/>
-              <w:t>|   |-- models/</w:t>
-              <w:br/>
               <w:t>|   `-- sample/</w:t>
               <w:br/>
               <w:t>|</w:t>
@@ -1042,8 +1038,6 @@
               <w:br/>
               <w:t>|   |   |-- report_service.py</w:t>
               <w:br/>
-              <w:t>|   |   |-- ml_service.py</w:t>
-              <w:br/>
               <w:t>|   |   `-- auth_service.py                  [P2+]</w:t>
               <w:br/>
               <w:t>|   |</w:t>
@@ -1057,8 +1051,6 @@
               <w:t>|   |   |-- analysis_schema.py</w:t>
               <w:br/>
               <w:t>|   |   |-- report_schema.py</w:t>
-              <w:br/>
-              <w:t>|   |   |-- ml_schema.py</w:t>
               <w:br/>
               <w:t>|   |   `-- user_schema.py</w:t>
               <w:br/>
@@ -1075,8 +1067,6 @@
               <w:t>|   |   |-- analysis_routes.py</w:t>
               <w:br/>
               <w:t>|   |   |-- report_routes.py</w:t>
-              <w:br/>
-              <w:t>|   |   |-- ml_routes.py</w:t>
               <w:br/>
               <w:t>|   |   `-- auth_routes.py</w:t>
               <w:br/>
@@ -1169,8 +1159,6 @@
               <w:t>|-- notebooks/                               [BOTH]</w:t>
               <w:br/>
               <w:t>|   |-- data_analysis_experiments.ipynb</w:t>
-              <w:br/>
-              <w:t>|   `-- ml_experiments.ipynb</w:t>
               <w:br/>
               <w:t>|</w:t>
               <w:br/>
@@ -1763,7 +1751,7 @@
                 <w:rFonts w:ascii="Aptos" w:hAnsi="Aptos"/>
                 <w:sz w:val="16"/>
               </w:rPr>
-              <w:t>Local uploads, processed files, reports, models, and samples.</w:t>
+              <w:t>Local uploads, processed files, reports, and samples.</w:t>
             </w:r>
           </w:p>
         </w:tc>
@@ -3071,59 +3059,6 @@
               <w:bottom w:w="70" w:type="dxa"/>
               <w:end w:w="80" w:type="dxa"/>
             </w:tcMar>
-          </w:tcPr>
-          <w:p>
-            <w:pPr>
-              <w:spacing w:after="0" w:line="240" w:lineRule="auto"/>
-            </w:pPr>
-            <w:r>
-              <w:rPr>
-                <w:rFonts w:ascii="Aptos" w:hAnsi="Aptos"/>
-                <w:sz w:val="16"/>
-              </w:rPr>
-              <w:t>frontend/pages/6_ML_Demo.py</w:t>
-            </w:r>
-          </w:p>
-        </w:tc>
-        <w:tc>
-          <w:tcPr>
-            <w:tcW w:type="dxa" w:w="5688"/>
-            <w:vAlign w:val="top"/>
-            <w:tcMar>
-              <w:top w:w="70" w:type="dxa"/>
-              <w:start w:w="80" w:type="dxa"/>
-              <w:bottom w:w="70" w:type="dxa"/>
-              <w:end w:w="80" w:type="dxa"/>
-            </w:tcMar>
-          </w:tcPr>
-          <w:p>
-            <w:pPr>
-              <w:spacing w:after="0" w:line="240" w:lineRule="auto"/>
-            </w:pPr>
-            <w:r>
-              <w:rPr>
-                <w:rFonts w:ascii="Aptos" w:hAnsi="Aptos"/>
-                <w:sz w:val="16"/>
-              </w:rPr>
-              <w:t>Runs the controlled ML workflow.</w:t>
-            </w:r>
-          </w:p>
-        </w:tc>
-      </w:tr>
-      <w:tr>
-        <w:trPr>
-          <w:cantSplit/>
-        </w:trPr>
-        <w:tc>
-          <w:tcPr>
-            <w:tcW w:type="dxa" w:w="3816"/>
-            <w:vAlign w:val="top"/>
-            <w:tcMar>
-              <w:top w:w="70" w:type="dxa"/>
-              <w:start w:w="80" w:type="dxa"/>
-              <w:bottom w:w="70" w:type="dxa"/>
-              <w:end w:w="80" w:type="dxa"/>
-            </w:tcMar>
             <w:shd w:fill="F2F4F6"/>
           </w:tcPr>
           <w:p>
@@ -3173,7 +3108,7 @@
     </w:p>
     <w:p>
       <w:r>
-        <w:t>These files should contain display and input logic only. They import backend services. They must not directly implement file movement, pandas cleaning, database CRUD, or model training.</w:t>
+        <w:t>These files should contain display and input logic only. They import backend services. They must not directly implement file movement, pandas cleaning, database CRUD, or database operations.</w:t>
       </w:r>
     </w:p>
     <w:p>
@@ -6490,7 +6425,7 @@
                 <w:rFonts w:ascii="Aptos" w:hAnsi="Aptos"/>
                 <w:sz w:val="17"/>
               </w:rPr>
-              <w:t>Report/model policy</w:t>
+              <w:t>Report policy</w:t>
             </w:r>
           </w:p>
         </w:tc>
@@ -6569,7 +6504,7 @@
                 <w:rFonts w:ascii="Aptos" w:hAnsi="Aptos"/>
                 <w:sz w:val="17"/>
               </w:rPr>
-              <w:t>Commit only .gitkeep/sample files, not uploads, databases, reports, models, or .env.</w:t>
+              <w:t>Commit only .gitkeep/sample files, not uploads, databases, reports, or .env.</w:t>
             </w:r>
           </w:p>
         </w:tc>
@@ -6842,7 +6777,7 @@
         <w:spacing w:after="40"/>
       </w:pPr>
       <w:r>
-        <w:t>Run parity tests: upload, list, analyze, clean, report, ML, and login.</w:t>
+        <w:t>Run parity tests: upload, list, analyze, clean, report, and login.</w:t>
       </w:r>
     </w:p>
     <w:p>
@@ -6927,7 +6862,7 @@
               </w:rPr>
               <w:t>mkdir data, docs, backend, frontend, notebooks, scripts, tests</w:t>
               <w:br/>
-              <w:t>mkdir data\uploads, data\processed, data\reports, data\models, data\sample</w:t>
+              <w:t>mkdir data\uploads, data\processed, data\reports, data\sample</w:t>
               <w:br/>
               <w:t>mkdir data\processed\csv, data\processed\images, data\processed\documents</w:t>
               <w:br/>
@@ -7090,8 +7025,6 @@
               <w:br/>
               <w:t>data/reports/*</w:t>
               <w:br/>
-              <w:t>data/models/*</w:t>
-              <w:br/>
               <w:t>*.db</w:t>
               <w:br/>
               <w:t>*.sqlite</w:t>
@@ -7106,8 +7039,6 @@
               <w:t>!data/processed/.gitkeep</w:t>
               <w:br/>
               <w:t>!data/reports/.gitkeep</w:t>
-              <w:br/>
-              <w:t>!data/models/.gitkeep</w:t>
               <w:br/>
               <w:br/>
               <w:t># Jupyter</w:t>

</xml_diff>